<commit_message>
Regard a leading noDots in front of a Key Signature as a part of the Key Signature to prevent misinterpreting it as an extra (empty) measure which will be reported as a warning later.
</commit_message>
<xml_diff>
--- a/Documentation/Log for development of version 5.0.0.0.docx
+++ b/Documentation/Log for development of version 5.0.0.0.docx
@@ -159,6 +159,82 @@
       <w:r>
         <w:rPr/>
         <w:t>MusicBrailleReader: Fixed error in initialisation of MusicBrailleReaderMainMenu by moving some code from constructor to a Create-Method to be used for the stand-alone version of the program.</w:t>
+      </w:r>
+    </w:p>
+    <w:p>
+      <w:pPr>
+        <w:pStyle w:val="Normal"/>
+        <w:bidi w:val="0"/>
+        <w:jc w:val="left"/>
+        <w:rPr/>
+      </w:pPr>
+      <w:r>
+        <w:rPr/>
+      </w:r>
+    </w:p>
+    <w:p>
+      <w:pPr>
+        <w:pStyle w:val="Normal"/>
+        <w:bidi w:val="0"/>
+        <w:jc w:val="left"/>
+        <w:rPr>
+          <w:b/>
+          <w:b/>
+          <w:bCs/>
+        </w:rPr>
+      </w:pPr>
+      <w:r>
+        <w:rPr>
+          <w:b/>
+          <w:bCs/>
+        </w:rPr>
+        <w:t>2022.01.07</w:t>
+      </w:r>
+    </w:p>
+    <w:p>
+      <w:pPr>
+        <w:pStyle w:val="Normal"/>
+        <w:bidi w:val="0"/>
+        <w:jc w:val="left"/>
+        <w:rPr/>
+      </w:pPr>
+      <w:r>
+        <w:rPr/>
+        <w:t>MusicBrailleReader .TokenReaderUtilities. AddKeySignature() :</w:t>
+      </w:r>
+    </w:p>
+    <w:p>
+      <w:pPr>
+        <w:pStyle w:val="Normal"/>
+        <w:bidi w:val="0"/>
+        <w:jc w:val="left"/>
+        <w:rPr/>
+      </w:pPr>
+      <w:r>
+        <w:rPr>
+          <w:rFonts w:ascii="Consolas" w:hAnsi="Consolas"/>
+          <w:color w:val="008000"/>
+          <w:sz w:val="19"/>
+          <w:highlight w:val="white"/>
+        </w:rPr>
+        <w:t>// Added 2022.01.07 to avoid "Empty measure ignored" by eating any NoDots in front of a keysignature.</w:t>
+      </w:r>
+    </w:p>
+    <w:p>
+      <w:pPr>
+        <w:pStyle w:val="Normal"/>
+        <w:bidi w:val="0"/>
+        <w:jc w:val="left"/>
+        <w:rPr/>
+      </w:pPr>
+      <w:r>
+        <w:rPr>
+          <w:rFonts w:ascii="Consolas" w:hAnsi="Consolas"/>
+          <w:color w:val="008000"/>
+          <w:sz w:val="19"/>
+          <w:highlight w:val="white"/>
+        </w:rPr>
+        <w:t>// Repeating all lines above, but inserting the "noDots" symbol first:</w:t>
       </w:r>
     </w:p>
     <w:p>
@@ -254,15 +330,12 @@
       <w:rPr>
         <w:rFonts w:ascii="Liberation Serif" w:hAnsi="Liberation Serif" w:eastAsia="SimSun" w:cs="Mangal"/>
         <w:kern w:val="2"/>
-        <w:sz w:val="24"/>
         <w:szCs w:val="24"/>
         <w:lang w:val="en-US" w:eastAsia="zh-CN" w:bidi="hi-IN"/>
       </w:rPr>
     </w:rPrDefault>
     <w:pPrDefault>
-      <w:pPr>
-        <w:widowControl/>
-      </w:pPr>
+      <w:pPr/>
     </w:pPrDefault>
   </w:docDefaults>
   <w:style w:type="paragraph" w:styleId="Normal">
@@ -270,10 +343,9 @@
     <w:qFormat/>
     <w:pPr>
       <w:widowControl/>
-      <w:kinsoku w:val="true"/>
-      <w:overflowPunct w:val="true"/>
-      <w:autoSpaceDE w:val="true"/>
+      <w:overflowPunct w:val="false"/>
       <w:bidi w:val="0"/>
+      <w:jc w:val="left"/>
     </w:pPr>
     <w:rPr>
       <w:rFonts w:ascii="Liberation Serif" w:hAnsi="Liberation Serif" w:eastAsia="SimSun" w:cs="Mangal"/>
@@ -349,7 +421,7 @@
     <w:pPr>
       <w:suppressLineNumbers/>
       <w:tabs>
-        <w:tab w:val="clear" w:pos="709"/>
+        <w:tab w:val="clear" w:pos="720"/>
         <w:tab w:val="center" w:pos="4986" w:leader="none"/>
         <w:tab w:val="right" w:pos="9972" w:leader="none"/>
       </w:tabs>

</xml_diff>